<commit_message>
Enlarge home type and buttons like Chinese Desk; swap U5 scan crops for clean exact figures.
Co-authored-by: Cursor <cursoragent@cursor.com>
</commit_message>
<xml_diff>
--- a/printables/u05/04-考前测试/U5_四上_第五单元_平行四边形和梯形_部分.docx
+++ b/printables/u05/04-考前测试/U5_四上_第五单元_平行四边形和梯形_部分.docx
@@ -280,7 +280,7 @@
       <w:r>
         <w:drawing>
           <wp:inline xmlns:a="http://schemas.openxmlformats.org/drawingml/2006/main" xmlns:pic="http://schemas.openxmlformats.org/drawingml/2006/picture">
-            <wp:extent cx="4320000" cy="2430000"/>
+            <wp:extent cx="4320000" cy="2496000"/>
             <wp:docPr id="3" name="Picture 3"/>
             <wp:cNvGraphicFramePr>
               <a:graphicFrameLocks noChangeAspect="1"/>
@@ -289,7 +289,7 @@
               <a:graphicData uri="http://schemas.openxmlformats.org/drawingml/2006/picture">
                 <pic:pic>
                   <pic:nvPicPr>
-                    <pic:cNvPr id="0" name="u5_abcd_hd.jpg"/>
+                    <pic:cNvPr id="0" name="u5_abcd_exact.jpg"/>
                     <pic:cNvPicPr/>
                   </pic:nvPicPr>
                   <pic:blipFill>
@@ -301,7 +301,7 @@
                   <pic:spPr>
                     <a:xfrm>
                       <a:off x="0" y="0"/>
-                      <a:ext cx="4320000" cy="2430000"/>
+                      <a:ext cx="4320000" cy="2496000"/>
                     </a:xfrm>
                     <a:prstGeom prst="rect"/>
                   </pic:spPr>
@@ -367,7 +367,7 @@
       <w:r>
         <w:drawing>
           <wp:inline xmlns:a="http://schemas.openxmlformats.org/drawingml/2006/main" xmlns:pic="http://schemas.openxmlformats.org/drawingml/2006/picture">
-            <wp:extent cx="3600000" cy="2700000"/>
+            <wp:extent cx="3240000" cy="1573714"/>
             <wp:docPr id="4" name="Picture 4"/>
             <wp:cNvGraphicFramePr>
               <a:graphicFrameLocks noChangeAspect="1"/>
@@ -376,7 +376,7 @@
               <a:graphicData uri="http://schemas.openxmlformats.org/drawingml/2006/picture">
                 <pic:pic>
                   <pic:nvPicPr>
-                    <pic:cNvPr id="0" name="u5_obscured_hd.jpg"/>
+                    <pic:cNvPr id="0" name="u5_obscured_exact.jpg"/>
                     <pic:cNvPicPr/>
                   </pic:nvPicPr>
                   <pic:blipFill>
@@ -388,7 +388,7 @@
                   <pic:spPr>
                     <a:xfrm>
                       <a:off x="0" y="0"/>
-                      <a:ext cx="3600000" cy="2700000"/>
+                      <a:ext cx="3240000" cy="1573714"/>
                     </a:xfrm>
                     <a:prstGeom prst="rect"/>
                   </pic:spPr>

</xml_diff>